<commit_message>
Rebuild the explainer on the Claude Design animation at 60 fps with labelled illustrations
</commit_message>
<xml_diff>
--- a/public/docs/tokenisation-explainer-script.docx
+++ b/public/docs/tokenisation-explainer-script.docx
@@ -458,7 +458,7 @@
                 <w:sz w:val="18"/>
                 <w:szCs w:val="18"/>
               </w:rPr>
-              <w:t xml:space="preserve">1</w:t>
+              <w:t xml:space="preserve">2</w:t>
             </w:r>
           </w:p>
         </w:tc>
@@ -961,6 +961,21 @@
               <w:t xml:space="preserve">Rules, programmed into the asset</w:t>
             </w:r>
           </w:p>
+          <w:p>
+            <w:pPr>
+              <w:spacing w:after="20"/>
+            </w:pPr>
+            <w:r>
+              <w:rPr>
+                <w:b w:val="false"/>
+                <w:bCs w:val="false"/>
+                <w:color w:val="343740"/>
+                <w:sz w:val="18"/>
+                <w:szCs w:val="18"/>
+              </w:rPr>
+              <w:t xml:space="preserve">In the illustrations: Ownership register, Before tokenisation, Investor 1, Investor 2, Investor 3, Recorded owner, Holding</w:t>
+            </w:r>
+          </w:p>
         </w:tc>
       </w:tr>
       <w:tr>
@@ -1122,6 +1137,21 @@
               <w:t xml:space="preserve">No separate tokenisation licence in Australia</w:t>
             </w:r>
           </w:p>
+          <w:p>
+            <w:pPr>
+              <w:spacing w:after="20"/>
+            </w:pPr>
+            <w:r>
+              <w:rPr>
+                <w:b w:val="false"/>
+                <w:bCs w:val="false"/>
+                <w:color w:val="343740"/>
+                <w:sz w:val="18"/>
+                <w:szCs w:val="18"/>
+              </w:rPr>
+              <w:t xml:space="preserve">In the illustrations: Trust deed, Fund constitutional document, Permits on-chain ownership records, and electronic transfer, Existing licence, AFSL, Covers issuing tokenised fund interests, the same way as traditional interests</w:t>
+            </w:r>
+          </w:p>
         </w:tc>
       </w:tr>
       <w:tr>
@@ -1283,6 +1313,21 @@
               <w:t xml:space="preserve">Token designed: asset class and rules</w:t>
             </w:r>
           </w:p>
+          <w:p>
+            <w:pPr>
+              <w:spacing w:after="20"/>
+            </w:pPr>
+            <w:r>
+              <w:rPr>
+                <w:b w:val="false"/>
+                <w:bCs w:val="false"/>
+                <w:color w:val="343740"/>
+                <w:sz w:val="18"/>
+                <w:szCs w:val="18"/>
+              </w:rPr>
+              <w:t xml:space="preserve">In the illustrations: Entity verification, Fund details, Token parameters, Fund manager, Fund, Entity verified, Asset class, Compliance rules</w:t>
+            </w:r>
+          </w:p>
         </w:tc>
       </w:tr>
       <w:tr>
@@ -1474,6 +1519,21 @@
               <w:t xml:space="preserve">Enforced automatically</w:t>
             </w:r>
           </w:p>
+          <w:p>
+            <w:pPr>
+              <w:spacing w:after="20"/>
+            </w:pPr>
+            <w:r>
+              <w:rPr>
+                <w:b w:val="false"/>
+                <w:bCs w:val="false"/>
+                <w:color w:val="343740"/>
+                <w:sz w:val="18"/>
+                <w:szCs w:val="18"/>
+              </w:rPr>
+              <w:t xml:space="preserve">In the illustrations: Compliance rules</w:t>
+            </w:r>
+          </w:p>
         </w:tc>
       </w:tr>
       <w:tr>
@@ -1650,6 +1710,21 @@
               <w:t xml:space="preserve">No tokens before verification</w:t>
             </w:r>
           </w:p>
+          <w:p>
+            <w:pPr>
+              <w:spacing w:after="20"/>
+            </w:pPr>
+            <w:r>
+              <w:rPr>
+                <w:b w:val="false"/>
+                <w:bCs w:val="false"/>
+                <w:color w:val="343740"/>
+                <w:sz w:val="18"/>
+                <w:szCs w:val="18"/>
+              </w:rPr>
+              <w:t xml:space="preserve">In the illustrations: Investor register, Onboarding status, Investor, Investor 1, Investor 2, Investor 3, Onboarding</w:t>
+            </w:r>
+          </w:p>
         </w:tc>
       </w:tr>
       <w:tr>
@@ -1794,6 +1869,21 @@
                 <w:szCs w:val="18"/>
               </w:rPr>
               <w:t xml:space="preserve">Official ownership record from the first token</w:t>
+            </w:r>
+          </w:p>
+          <w:p>
+            <w:pPr>
+              <w:spacing w:after="20"/>
+            </w:pPr>
+            <w:r>
+              <w:rPr>
+                <w:b w:val="false"/>
+                <w:bCs w:val="false"/>
+                <w:color w:val="343740"/>
+                <w:sz w:val="18"/>
+                <w:szCs w:val="18"/>
+              </w:rPr>
+              <w:t xml:space="preserve">In the illustrations: Register of record, Investor 1, Investor 2, Investor 3, Verified wallet</w:t>
             </w:r>
           </w:p>
         </w:tc>
@@ -3392,7 +3482,7 @@
                 <w:sz w:val="18"/>
                 <w:szCs w:val="18"/>
               </w:rPr>
-              <w:t xml:space="preserve">platform onboarding on Tokeniser</w:t>
+              <w:t xml:space="preserve">Trust deed, fund constitutional document</w:t>
             </w:r>
           </w:p>
         </w:tc>
@@ -3471,7 +3561,7 @@
                 <w:sz w:val="18"/>
                 <w:szCs w:val="18"/>
               </w:rPr>
-              <w:t xml:space="preserve">"Once the legal framework is in place, the fund manager completes Tokeniser's platform onboarding process."</w:t>
+              <w:t xml:space="preserve">"Review the fund's constitutional documents, the trust deed, constitution, or shareholder agreement"</w:t>
             </w:r>
           </w:p>
         </w:tc>
@@ -3540,7 +3630,7 @@
                 <w:sz w:val="18"/>
                 <w:szCs w:val="18"/>
               </w:rPr>
-              <w:t xml:space="preserve">The manager and the fund are verified</w:t>
+              <w:t xml:space="preserve">Permits on-chain ownership records and electronic transfer</w:t>
             </w:r>
           </w:p>
         </w:tc>
@@ -3619,7 +3709,7 @@
                 <w:sz w:val="18"/>
                 <w:szCs w:val="18"/>
               </w:rPr>
-              <w:t xml:space="preserve">"Complete entity verification for the fund manager and the fund."</w:t>
+              <w:t xml:space="preserve">"Some documents need amendment to permit on-chain ownership records and electronic transfer."</w:t>
             </w:r>
           </w:p>
         </w:tc>
@@ -3688,7 +3778,7 @@
                 <w:sz w:val="18"/>
                 <w:szCs w:val="18"/>
               </w:rPr>
-              <w:t xml:space="preserve">the token is designed: asset class and rules</w:t>
+              <w:t xml:space="preserve">Existing licence, AFSL, covers issuing tokenised fund interests the same way as traditional interests</w:t>
             </w:r>
           </w:p>
         </w:tc>
@@ -3767,7 +3857,7 @@
                 <w:sz w:val="18"/>
                 <w:szCs w:val="18"/>
               </w:rPr>
-              <w:t xml:space="preserve">"For new funds, design the token parameters: asset class, compliance rules, and corporate action schedule."</w:t>
+              <w:t xml:space="preserve">"existing AFSL (or their reliance on an AFSL holder) covers the issuance of tokenised fund interests in the same way it covers traditional interests"</w:t>
             </w:r>
           </w:p>
         </w:tc>
@@ -3836,7 +3926,7 @@
                 <w:sz w:val="18"/>
                 <w:szCs w:val="18"/>
               </w:rPr>
-              <w:t xml:space="preserve">Identity checks (KYC/AML)</w:t>
+              <w:t xml:space="preserve">platform onboarding on Tokeniser</w:t>
             </w:r>
           </w:p>
         </w:tc>
@@ -3915,7 +4005,7 @@
                 <w:sz w:val="18"/>
                 <w:szCs w:val="18"/>
               </w:rPr>
-              <w:t xml:space="preserve">"Configure KYC/AML verification requirements for investors."</w:t>
+              <w:t xml:space="preserve">"Once the legal framework is in place, the fund manager completes Tokeniser's platform onboarding process."</w:t>
             </w:r>
           </w:p>
         </w:tc>
@@ -3984,7 +4074,7 @@
                 <w:sz w:val="18"/>
                 <w:szCs w:val="18"/>
               </w:rPr>
-              <w:t xml:space="preserve">who may invest</w:t>
+              <w:t xml:space="preserve">The manager and the fund are verified</w:t>
             </w:r>
           </w:p>
         </w:tc>
@@ -4063,7 +4153,7 @@
                 <w:sz w:val="18"/>
                 <w:szCs w:val="18"/>
               </w:rPr>
-              <w:t xml:space="preserve">"Set investor eligibility criteria, wholesale status, accredited investor status, and foreign investor limits."</w:t>
+              <w:t xml:space="preserve">"Complete entity verification for the fund manager and the fund."</w:t>
             </w:r>
           </w:p>
         </w:tc>
@@ -4132,7 +4222,7 @@
                 <w:sz w:val="18"/>
                 <w:szCs w:val="18"/>
               </w:rPr>
-              <w:t xml:space="preserve">transfer limits</w:t>
+              <w:t xml:space="preserve">the token is designed: asset class and rules</w:t>
             </w:r>
           </w:p>
         </w:tc>
@@ -4211,7 +4301,7 @@
                 <w:sz w:val="18"/>
                 <w:szCs w:val="18"/>
               </w:rPr>
-              <w:t xml:space="preserve">"Set transfer restrictions, lock-up periods, permitted transferee classes, and any fund-specific restrictions."</w:t>
+              <w:t xml:space="preserve">"For new funds, design the token parameters: asset class, compliance rules, and corporate action schedule."</w:t>
             </w:r>
           </w:p>
         </w:tc>
@@ -4280,7 +4370,7 @@
                 <w:sz w:val="18"/>
                 <w:szCs w:val="18"/>
               </w:rPr>
-              <w:t xml:space="preserve">encoded into the token and enforced automatically</w:t>
+              <w:t xml:space="preserve">Entity verification, Fund details</w:t>
             </w:r>
           </w:p>
         </w:tc>
@@ -4312,22 +4402,22 @@
                 <w:sz w:val="18"/>
                 <w:szCs w:val="18"/>
               </w:rPr>
-              <w:t xml:space="preserve">Tokeniser knowledge hub: How does Tokeniser work</w:t>
-            </w:r>
-          </w:p>
-          <w:p>
-            <w:pPr>
-              <w:spacing w:after="20"/>
-            </w:pPr>
-            <w:r>
-              <w:rPr>
-                <w:b w:val="false"/>
-                <w:bCs w:val="false"/>
-                <w:color w:val="343740"/>
-                <w:sz w:val="18"/>
-                <w:szCs w:val="18"/>
-              </w:rPr>
-              <w:t xml:space="preserve">https://tokeniser.com/resources/knowledge-hub/platform/how-does-tokeniser-work</w:t>
+              <w:t xml:space="preserve">Tokeniser knowledge hub: How to tokenise a fund in Australia</w:t>
+            </w:r>
+          </w:p>
+          <w:p>
+            <w:pPr>
+              <w:spacing w:after="20"/>
+            </w:pPr>
+            <w:r>
+              <w:rPr>
+                <w:b w:val="false"/>
+                <w:bCs w:val="false"/>
+                <w:color w:val="343740"/>
+                <w:sz w:val="18"/>
+                <w:szCs w:val="18"/>
+              </w:rPr>
+              <w:t xml:space="preserve">https://tokeniser.com/resources/knowledge-hub/australia/how-to-tokenise-a-fund-in-australia</w:t>
             </w:r>
           </w:p>
         </w:tc>
@@ -4359,7 +4449,7 @@
                 <w:sz w:val="18"/>
                 <w:szCs w:val="18"/>
               </w:rPr>
-              <w:t xml:space="preserve">"Compliance rules are encoded into the token at issuance and enforced automatically at every transfer."</w:t>
+              <w:t xml:space="preserve">"configuration of the fund's details on the platform"</w:t>
             </w:r>
           </w:p>
         </w:tc>
@@ -4428,7 +4518,7 @@
                 <w:sz w:val="18"/>
                 <w:szCs w:val="18"/>
               </w:rPr>
-              <w:t xml:space="preserve">Each investor verifies their identity and gets a digital wallet</w:t>
+              <w:t xml:space="preserve">Fund manager, Fund, Entity verified</w:t>
             </w:r>
           </w:p>
         </w:tc>
@@ -4507,7 +4597,7 @@
                 <w:sz w:val="18"/>
                 <w:szCs w:val="18"/>
               </w:rPr>
-              <w:t xml:space="preserve">"Investors complete digital onboarding, identity verification, investor classification, and wallet setup, before their tokens are issued."</w:t>
+              <w:t xml:space="preserve">"Complete entity verification for the fund manager and the fund."</w:t>
             </w:r>
           </w:p>
         </w:tc>
@@ -4576,7 +4666,7 @@
                 <w:sz w:val="18"/>
                 <w:szCs w:val="18"/>
               </w:rPr>
-              <w:t xml:space="preserve">No tokens are issued until then</w:t>
+              <w:t xml:space="preserve">Token parameters, Asset class, Compliance rules</w:t>
             </w:r>
           </w:p>
         </w:tc>
@@ -4608,22 +4698,22 @@
                 <w:sz w:val="18"/>
                 <w:szCs w:val="18"/>
               </w:rPr>
-              <w:t xml:space="preserve">Tokeniser knowledge hub: How does Tokeniser work</w:t>
-            </w:r>
-          </w:p>
-          <w:p>
-            <w:pPr>
-              <w:spacing w:after="20"/>
-            </w:pPr>
-            <w:r>
-              <w:rPr>
-                <w:b w:val="false"/>
-                <w:bCs w:val="false"/>
-                <w:color w:val="343740"/>
-                <w:sz w:val="18"/>
-                <w:szCs w:val="18"/>
-              </w:rPr>
-              <w:t xml:space="preserve">https://tokeniser.com/resources/knowledge-hub/platform/how-does-tokeniser-work</w:t>
+              <w:t xml:space="preserve">Tokeniser knowledge hub: How to tokenise a fund in Australia</w:t>
+            </w:r>
+          </w:p>
+          <w:p>
+            <w:pPr>
+              <w:spacing w:after="20"/>
+            </w:pPr>
+            <w:r>
+              <w:rPr>
+                <w:b w:val="false"/>
+                <w:bCs w:val="false"/>
+                <w:color w:val="343740"/>
+                <w:sz w:val="18"/>
+                <w:szCs w:val="18"/>
+              </w:rPr>
+              <w:t xml:space="preserve">https://tokeniser.com/resources/knowledge-hub/australia/how-to-tokenise-a-fund-in-australia</w:t>
             </w:r>
           </w:p>
         </w:tc>
@@ -4655,7 +4745,7 @@
                 <w:sz w:val="18"/>
                 <w:szCs w:val="18"/>
               </w:rPr>
-              <w:t xml:space="preserve">"Until onboarding is complete and the wallet is verified, tokens cannot be issued to or transferred to that investor."</w:t>
+              <w:t xml:space="preserve">"For new funds, design the token parameters: asset class, compliance rules, and corporate action schedule."</w:t>
             </w:r>
           </w:p>
         </w:tc>
@@ -4724,7 +4814,7 @@
                 <w:sz w:val="18"/>
                 <w:szCs w:val="18"/>
               </w:rPr>
-              <w:t xml:space="preserve">issued on Redbelly Network, into verified wallets</w:t>
+              <w:t xml:space="preserve">Identity checks (KYC/AML)</w:t>
             </w:r>
           </w:p>
         </w:tc>
@@ -4756,22 +4846,22 @@
                 <w:sz w:val="18"/>
                 <w:szCs w:val="18"/>
               </w:rPr>
-              <w:t xml:space="preserve">Tokeniser knowledge hub: How does Tokeniser work</w:t>
-            </w:r>
-          </w:p>
-          <w:p>
-            <w:pPr>
-              <w:spacing w:after="20"/>
-            </w:pPr>
-            <w:r>
-              <w:rPr>
-                <w:b w:val="false"/>
-                <w:bCs w:val="false"/>
-                <w:color w:val="343740"/>
-                <w:sz w:val="18"/>
-                <w:szCs w:val="18"/>
-              </w:rPr>
-              <w:t xml:space="preserve">https://tokeniser.com/resources/knowledge-hub/platform/how-does-tokeniser-work</w:t>
+              <w:t xml:space="preserve">Tokeniser knowledge hub: How to tokenise a fund in Australia</w:t>
+            </w:r>
+          </w:p>
+          <w:p>
+            <w:pPr>
+              <w:spacing w:after="20"/>
+            </w:pPr>
+            <w:r>
+              <w:rPr>
+                <w:b w:val="false"/>
+                <w:bCs w:val="false"/>
+                <w:color w:val="343740"/>
+                <w:sz w:val="18"/>
+                <w:szCs w:val="18"/>
+              </w:rPr>
+              <w:t xml:space="preserve">https://tokeniser.com/resources/knowledge-hub/australia/how-to-tokenise-a-fund-in-australia</w:t>
             </w:r>
           </w:p>
         </w:tc>
@@ -4803,7 +4893,7 @@
                 <w:sz w:val="18"/>
                 <w:szCs w:val="18"/>
               </w:rPr>
-              <w:t xml:space="preserve">"Tokens are minted on Redbelly Network and transferred to the verified investor wallets."</w:t>
+              <w:t xml:space="preserve">"Configure KYC/AML verification requirements for investors."</w:t>
             </w:r>
           </w:p>
         </w:tc>
@@ -4872,7 +4962,7 @@
                 <w:sz w:val="18"/>
                 <w:szCs w:val="18"/>
               </w:rPr>
-              <w:t xml:space="preserve">this register is the official record of ownership</w:t>
+              <w:t xml:space="preserve">who may invest</w:t>
             </w:r>
           </w:p>
         </w:tc>
@@ -4951,7 +5041,7 @@
                 <w:sz w:val="18"/>
                 <w:szCs w:val="18"/>
               </w:rPr>
-              <w:t xml:space="preserve">"The on-chain register is the register of record from day one."</w:t>
+              <w:t xml:space="preserve">"Set investor eligibility criteria, wholesale status, accredited investor status, and foreign investor limits."</w:t>
             </w:r>
           </w:p>
         </w:tc>
@@ -5020,7 +5110,7 @@
                 <w:sz w:val="18"/>
                 <w:szCs w:val="18"/>
               </w:rPr>
-              <w:t xml:space="preserve">From the first token</w:t>
+              <w:t xml:space="preserve">transfer limits</w:t>
             </w:r>
           </w:p>
         </w:tc>
@@ -5099,7 +5189,7 @@
                 <w:sz w:val="18"/>
                 <w:szCs w:val="18"/>
               </w:rPr>
-              <w:t xml:space="preserve">"For a new fund, the investor register is established on-chain at the point of the first token issuance."</w:t>
+              <w:t xml:space="preserve">"Set transfer restrictions, lock-up periods, permitted transferee classes, and any fund-specific restrictions."</w:t>
             </w:r>
           </w:p>
         </w:tc>
@@ -5168,7 +5258,7 @@
                 <w:sz w:val="18"/>
                 <w:szCs w:val="18"/>
               </w:rPr>
-              <w:t xml:space="preserve">Every transfer is checked against the rules first</w:t>
+              <w:t xml:space="preserve">encoded into the token and enforced automatically</w:t>
             </w:r>
           </w:p>
         </w:tc>
@@ -5247,7 +5337,7 @@
                 <w:sz w:val="18"/>
                 <w:szCs w:val="18"/>
               </w:rPr>
-              <w:t xml:space="preserve">"Every transfer is checked against configured compliance parameters before submission."</w:t>
+              <w:t xml:space="preserve">"Compliance rules are encoded into the token at issuance and enforced automatically at every transfer."</w:t>
             </w:r>
           </w:p>
         </w:tc>
@@ -5316,7 +5406,7 @@
                 <w:sz w:val="18"/>
                 <w:szCs w:val="18"/>
               </w:rPr>
-              <w:t xml:space="preserve">breaches are rejected</w:t>
+              <w:t xml:space="preserve">Compliance rules</w:t>
             </w:r>
           </w:p>
         </w:tc>
@@ -5395,7 +5485,7 @@
                 <w:sz w:val="18"/>
                 <w:szCs w:val="18"/>
               </w:rPr>
-              <w:t xml:space="preserve">"Transfers to unverified wallets, ineligible investors, or in breach of restrictions are rejected."</w:t>
+              <w:t xml:space="preserve">"Compliance rules are encoded into the token at issuance and enforced automatically at every transfer."</w:t>
             </w:r>
           </w:p>
         </w:tc>
@@ -5464,7 +5554,7 @@
                 <w:sz w:val="18"/>
                 <w:szCs w:val="18"/>
               </w:rPr>
-              <w:t xml:space="preserve">When investors hold their own wallet</w:t>
+              <w:t xml:space="preserve">Each investor verifies their identity and gets a digital wallet</w:t>
             </w:r>
           </w:p>
         </w:tc>
@@ -5496,22 +5586,22 @@
                 <w:sz w:val="18"/>
                 <w:szCs w:val="18"/>
               </w:rPr>
-              <w:t xml:space="preserve">Tokeniser knowledge hub: How does Tokeniser work</w:t>
-            </w:r>
-          </w:p>
-          <w:p>
-            <w:pPr>
-              <w:spacing w:after="20"/>
-            </w:pPr>
-            <w:r>
-              <w:rPr>
-                <w:b w:val="false"/>
-                <w:bCs w:val="false"/>
-                <w:color w:val="343740"/>
-                <w:sz w:val="18"/>
-                <w:szCs w:val="18"/>
-              </w:rPr>
-              <w:t xml:space="preserve">https://tokeniser.com/resources/knowledge-hub/platform/how-does-tokeniser-work</w:t>
+              <w:t xml:space="preserve">Tokeniser knowledge hub: How to tokenise a fund in Australia</w:t>
+            </w:r>
+          </w:p>
+          <w:p>
+            <w:pPr>
+              <w:spacing w:after="20"/>
+            </w:pPr>
+            <w:r>
+              <w:rPr>
+                <w:b w:val="false"/>
+                <w:bCs w:val="false"/>
+                <w:color w:val="343740"/>
+                <w:sz w:val="18"/>
+                <w:szCs w:val="18"/>
+              </w:rPr>
+              <w:t xml:space="preserve">https://tokeniser.com/resources/knowledge-hub/australia/how-to-tokenise-a-fund-in-australia</w:t>
             </w:r>
           </w:p>
         </w:tc>
@@ -5543,7 +5633,7 @@
                 <w:sz w:val="18"/>
                 <w:szCs w:val="18"/>
               </w:rPr>
-              <w:t xml:space="preserve">"the investor either holds their own private key (non-custodial wallet)"</w:t>
+              <w:t xml:space="preserve">"Investors complete digital onboarding, identity verification, investor classification, and wallet setup, before their tokens are issued."</w:t>
             </w:r>
           </w:p>
         </w:tc>
@@ -5612,7 +5702,7 @@
                 <w:sz w:val="18"/>
                 <w:szCs w:val="18"/>
               </w:rPr>
-              <w:t xml:space="preserve">transfer and payment complete together, in seconds</w:t>
+              <w:t xml:space="preserve">No tokens are issued until then</w:t>
             </w:r>
           </w:p>
         </w:tc>
@@ -5691,7 +5781,7 @@
                 <w:sz w:val="18"/>
                 <w:szCs w:val="18"/>
               </w:rPr>
-              <w:t xml:space="preserve">"For non-custodial wallets, atomic settlements, transfer and payment complete simultaneously in seconds."</w:t>
+              <w:t xml:space="preserve">"Until onboarding is complete and the wallet is verified, tokens cannot be issued to or transferred to that investor."</w:t>
             </w:r>
           </w:p>
         </w:tc>
@@ -5760,7 +5850,7 @@
                 <w:sz w:val="18"/>
                 <w:szCs w:val="18"/>
               </w:rPr>
-              <w:t xml:space="preserve">Tokeniser operates on Redbelly Network, Australia's public digital token infrastructure</w:t>
+              <w:t xml:space="preserve">issued on Redbelly Network, into verified wallets</w:t>
             </w:r>
           </w:p>
         </w:tc>
@@ -5792,22 +5882,22 @@
                 <w:sz w:val="18"/>
                 <w:szCs w:val="18"/>
               </w:rPr>
-              <w:t xml:space="preserve">Tokeniser, home page and FAQ</w:t>
-            </w:r>
-          </w:p>
-          <w:p>
-            <w:pPr>
-              <w:spacing w:after="20"/>
-            </w:pPr>
-            <w:r>
-              <w:rPr>
-                <w:b w:val="false"/>
-                <w:bCs w:val="false"/>
-                <w:color w:val="343740"/>
-                <w:sz w:val="18"/>
-                <w:szCs w:val="18"/>
-              </w:rPr>
-              <w:t xml:space="preserve">https://tokeniser.com/</w:t>
+              <w:t xml:space="preserve">Tokeniser knowledge hub: How does Tokeniser work</w:t>
+            </w:r>
+          </w:p>
+          <w:p>
+            <w:pPr>
+              <w:spacing w:after="20"/>
+            </w:pPr>
+            <w:r>
+              <w:rPr>
+                <w:b w:val="false"/>
+                <w:bCs w:val="false"/>
+                <w:color w:val="343740"/>
+                <w:sz w:val="18"/>
+                <w:szCs w:val="18"/>
+              </w:rPr>
+              <w:t xml:space="preserve">https://tokeniser.com/resources/knowledge-hub/platform/how-does-tokeniser-work</w:t>
             </w:r>
           </w:p>
         </w:tc>
@@ -5839,7 +5929,7 @@
                 <w:sz w:val="18"/>
                 <w:szCs w:val="18"/>
               </w:rPr>
-              <w:t xml:space="preserve">"Tokeniser operates on Redbelly Network, Australia's public digital token infrastructure"</w:t>
+              <w:t xml:space="preserve">"Tokens are minted on Redbelly Network and transferred to the verified investor wallets."</w:t>
             </w:r>
           </w:p>
         </w:tc>
@@ -5877,6 +5967,1190 @@
                 <w:szCs w:val="18"/>
               </w:rPr>
               <w:t xml:space="preserve">25</w:t>
+            </w:r>
+          </w:p>
+        </w:tc>
+        <w:tc>
+          <w:tcPr>
+            <w:tcW w:type="dxa" w:w="2400"/>
+            <w:tcBorders>
+              <w:top w:val="single" w:color="BDC1CB" w:sz="4"/>
+              <w:left w:val="single" w:color="BDC1CB" w:sz="4"/>
+              <w:bottom w:val="single" w:color="BDC1CB" w:sz="4"/>
+              <w:right w:val="single" w:color="BDC1CB" w:sz="4"/>
+            </w:tcBorders>
+            <w:tcMar>
+              <w:top w:type="dxa" w:w="60"/>
+              <w:left w:type="dxa" w:w="100"/>
+              <w:bottom w:type="dxa" w:w="60"/>
+              <w:right w:type="dxa" w:w="100"/>
+            </w:tcMar>
+          </w:tcPr>
+          <w:p>
+            <w:pPr>
+              <w:spacing w:after="20"/>
+            </w:pPr>
+            <w:r>
+              <w:rPr>
+                <w:b w:val="false"/>
+                <w:bCs w:val="false"/>
+                <w:color w:val="343740"/>
+                <w:sz w:val="18"/>
+                <w:szCs w:val="18"/>
+              </w:rPr>
+              <w:t xml:space="preserve">this register is the official record of ownership</w:t>
+            </w:r>
+          </w:p>
+        </w:tc>
+        <w:tc>
+          <w:tcPr>
+            <w:tcW w:type="dxa" w:w="2900"/>
+            <w:tcBorders>
+              <w:top w:val="single" w:color="BDC1CB" w:sz="4"/>
+              <w:left w:val="single" w:color="BDC1CB" w:sz="4"/>
+              <w:bottom w:val="single" w:color="BDC1CB" w:sz="4"/>
+              <w:right w:val="single" w:color="BDC1CB" w:sz="4"/>
+            </w:tcBorders>
+            <w:tcMar>
+              <w:top w:type="dxa" w:w="60"/>
+              <w:left w:type="dxa" w:w="100"/>
+              <w:bottom w:type="dxa" w:w="60"/>
+              <w:right w:type="dxa" w:w="100"/>
+            </w:tcMar>
+          </w:tcPr>
+          <w:p>
+            <w:pPr>
+              <w:spacing w:after="20"/>
+            </w:pPr>
+            <w:r>
+              <w:rPr>
+                <w:b w:val="false"/>
+                <w:bCs w:val="false"/>
+                <w:color w:val="343740"/>
+                <w:sz w:val="18"/>
+                <w:szCs w:val="18"/>
+              </w:rPr>
+              <w:t xml:space="preserve">Tokeniser knowledge hub: How to tokenise a fund in Australia</w:t>
+            </w:r>
+          </w:p>
+          <w:p>
+            <w:pPr>
+              <w:spacing w:after="20"/>
+            </w:pPr>
+            <w:r>
+              <w:rPr>
+                <w:b w:val="false"/>
+                <w:bCs w:val="false"/>
+                <w:color w:val="343740"/>
+                <w:sz w:val="18"/>
+                <w:szCs w:val="18"/>
+              </w:rPr>
+              <w:t xml:space="preserve">https://tokeniser.com/resources/knowledge-hub/australia/how-to-tokenise-a-fund-in-australia</w:t>
+            </w:r>
+          </w:p>
+        </w:tc>
+        <w:tc>
+          <w:tcPr>
+            <w:tcW w:type="dxa" w:w="3838"/>
+            <w:tcBorders>
+              <w:top w:val="single" w:color="BDC1CB" w:sz="4"/>
+              <w:left w:val="single" w:color="BDC1CB" w:sz="4"/>
+              <w:bottom w:val="single" w:color="BDC1CB" w:sz="4"/>
+              <w:right w:val="single" w:color="BDC1CB" w:sz="4"/>
+            </w:tcBorders>
+            <w:tcMar>
+              <w:top w:type="dxa" w:w="60"/>
+              <w:left w:type="dxa" w:w="100"/>
+              <w:bottom w:type="dxa" w:w="60"/>
+              <w:right w:type="dxa" w:w="100"/>
+            </w:tcMar>
+          </w:tcPr>
+          <w:p>
+            <w:pPr>
+              <w:spacing w:after="20"/>
+            </w:pPr>
+            <w:r>
+              <w:rPr>
+                <w:b w:val="false"/>
+                <w:bCs w:val="false"/>
+                <w:color w:val="343740"/>
+                <w:sz w:val="18"/>
+                <w:szCs w:val="18"/>
+              </w:rPr>
+              <w:t xml:space="preserve">"The on-chain register is the register of record from day one."</w:t>
+            </w:r>
+          </w:p>
+        </w:tc>
+      </w:tr>
+      <w:tr>
+        <w:trPr>
+          <w:tblHeader w:val="false"/>
+        </w:trPr>
+        <w:tc>
+          <w:tcPr>
+            <w:tcW w:type="dxa" w:w="500"/>
+            <w:tcBorders>
+              <w:top w:val="single" w:color="BDC1CB" w:sz="4"/>
+              <w:left w:val="single" w:color="BDC1CB" w:sz="4"/>
+              <w:bottom w:val="single" w:color="BDC1CB" w:sz="4"/>
+              <w:right w:val="single" w:color="BDC1CB" w:sz="4"/>
+            </w:tcBorders>
+            <w:tcMar>
+              <w:top w:type="dxa" w:w="60"/>
+              <w:left w:type="dxa" w:w="100"/>
+              <w:bottom w:type="dxa" w:w="60"/>
+              <w:right w:type="dxa" w:w="100"/>
+            </w:tcMar>
+          </w:tcPr>
+          <w:p>
+            <w:pPr>
+              <w:spacing w:after="20"/>
+            </w:pPr>
+            <w:r>
+              <w:rPr>
+                <w:b w:val="false"/>
+                <w:bCs w:val="false"/>
+                <w:color w:val="343740"/>
+                <w:sz w:val="18"/>
+                <w:szCs w:val="18"/>
+              </w:rPr>
+              <w:t xml:space="preserve">26</w:t>
+            </w:r>
+          </w:p>
+        </w:tc>
+        <w:tc>
+          <w:tcPr>
+            <w:tcW w:type="dxa" w:w="2400"/>
+            <w:tcBorders>
+              <w:top w:val="single" w:color="BDC1CB" w:sz="4"/>
+              <w:left w:val="single" w:color="BDC1CB" w:sz="4"/>
+              <w:bottom w:val="single" w:color="BDC1CB" w:sz="4"/>
+              <w:right w:val="single" w:color="BDC1CB" w:sz="4"/>
+            </w:tcBorders>
+            <w:tcMar>
+              <w:top w:type="dxa" w:w="60"/>
+              <w:left w:type="dxa" w:w="100"/>
+              <w:bottom w:type="dxa" w:w="60"/>
+              <w:right w:type="dxa" w:w="100"/>
+            </w:tcMar>
+          </w:tcPr>
+          <w:p>
+            <w:pPr>
+              <w:spacing w:after="20"/>
+            </w:pPr>
+            <w:r>
+              <w:rPr>
+                <w:b w:val="false"/>
+                <w:bCs w:val="false"/>
+                <w:color w:val="343740"/>
+                <w:sz w:val="18"/>
+                <w:szCs w:val="18"/>
+              </w:rPr>
+              <w:t xml:space="preserve">From the first token</w:t>
+            </w:r>
+          </w:p>
+        </w:tc>
+        <w:tc>
+          <w:tcPr>
+            <w:tcW w:type="dxa" w:w="2900"/>
+            <w:tcBorders>
+              <w:top w:val="single" w:color="BDC1CB" w:sz="4"/>
+              <w:left w:val="single" w:color="BDC1CB" w:sz="4"/>
+              <w:bottom w:val="single" w:color="BDC1CB" w:sz="4"/>
+              <w:right w:val="single" w:color="BDC1CB" w:sz="4"/>
+            </w:tcBorders>
+            <w:tcMar>
+              <w:top w:type="dxa" w:w="60"/>
+              <w:left w:type="dxa" w:w="100"/>
+              <w:bottom w:type="dxa" w:w="60"/>
+              <w:right w:type="dxa" w:w="100"/>
+            </w:tcMar>
+          </w:tcPr>
+          <w:p>
+            <w:pPr>
+              <w:spacing w:after="20"/>
+            </w:pPr>
+            <w:r>
+              <w:rPr>
+                <w:b w:val="false"/>
+                <w:bCs w:val="false"/>
+                <w:color w:val="343740"/>
+                <w:sz w:val="18"/>
+                <w:szCs w:val="18"/>
+              </w:rPr>
+              <w:t xml:space="preserve">Tokeniser knowledge hub: How to tokenise a fund in Australia</w:t>
+            </w:r>
+          </w:p>
+          <w:p>
+            <w:pPr>
+              <w:spacing w:after="20"/>
+            </w:pPr>
+            <w:r>
+              <w:rPr>
+                <w:b w:val="false"/>
+                <w:bCs w:val="false"/>
+                <w:color w:val="343740"/>
+                <w:sz w:val="18"/>
+                <w:szCs w:val="18"/>
+              </w:rPr>
+              <w:t xml:space="preserve">https://tokeniser.com/resources/knowledge-hub/australia/how-to-tokenise-a-fund-in-australia</w:t>
+            </w:r>
+          </w:p>
+        </w:tc>
+        <w:tc>
+          <w:tcPr>
+            <w:tcW w:type="dxa" w:w="3838"/>
+            <w:tcBorders>
+              <w:top w:val="single" w:color="BDC1CB" w:sz="4"/>
+              <w:left w:val="single" w:color="BDC1CB" w:sz="4"/>
+              <w:bottom w:val="single" w:color="BDC1CB" w:sz="4"/>
+              <w:right w:val="single" w:color="BDC1CB" w:sz="4"/>
+            </w:tcBorders>
+            <w:tcMar>
+              <w:top w:type="dxa" w:w="60"/>
+              <w:left w:type="dxa" w:w="100"/>
+              <w:bottom w:type="dxa" w:w="60"/>
+              <w:right w:type="dxa" w:w="100"/>
+            </w:tcMar>
+          </w:tcPr>
+          <w:p>
+            <w:pPr>
+              <w:spacing w:after="20"/>
+            </w:pPr>
+            <w:r>
+              <w:rPr>
+                <w:b w:val="false"/>
+                <w:bCs w:val="false"/>
+                <w:color w:val="343740"/>
+                <w:sz w:val="18"/>
+                <w:szCs w:val="18"/>
+              </w:rPr>
+              <w:t xml:space="preserve">"For a new fund, the investor register is established on-chain at the point of the first token issuance."</w:t>
+            </w:r>
+          </w:p>
+        </w:tc>
+      </w:tr>
+      <w:tr>
+        <w:trPr>
+          <w:tblHeader w:val="false"/>
+        </w:trPr>
+        <w:tc>
+          <w:tcPr>
+            <w:tcW w:type="dxa" w:w="500"/>
+            <w:tcBorders>
+              <w:top w:val="single" w:color="BDC1CB" w:sz="4"/>
+              <w:left w:val="single" w:color="BDC1CB" w:sz="4"/>
+              <w:bottom w:val="single" w:color="BDC1CB" w:sz="4"/>
+              <w:right w:val="single" w:color="BDC1CB" w:sz="4"/>
+            </w:tcBorders>
+            <w:tcMar>
+              <w:top w:type="dxa" w:w="60"/>
+              <w:left w:type="dxa" w:w="100"/>
+              <w:bottom w:type="dxa" w:w="60"/>
+              <w:right w:type="dxa" w:w="100"/>
+            </w:tcMar>
+          </w:tcPr>
+          <w:p>
+            <w:pPr>
+              <w:spacing w:after="20"/>
+            </w:pPr>
+            <w:r>
+              <w:rPr>
+                <w:b w:val="false"/>
+                <w:bCs w:val="false"/>
+                <w:color w:val="343740"/>
+                <w:sz w:val="18"/>
+                <w:szCs w:val="18"/>
+              </w:rPr>
+              <w:t xml:space="preserve">27</w:t>
+            </w:r>
+          </w:p>
+        </w:tc>
+        <w:tc>
+          <w:tcPr>
+            <w:tcW w:type="dxa" w:w="2400"/>
+            <w:tcBorders>
+              <w:top w:val="single" w:color="BDC1CB" w:sz="4"/>
+              <w:left w:val="single" w:color="BDC1CB" w:sz="4"/>
+              <w:bottom w:val="single" w:color="BDC1CB" w:sz="4"/>
+              <w:right w:val="single" w:color="BDC1CB" w:sz="4"/>
+            </w:tcBorders>
+            <w:tcMar>
+              <w:top w:type="dxa" w:w="60"/>
+              <w:left w:type="dxa" w:w="100"/>
+              <w:bottom w:type="dxa" w:w="60"/>
+              <w:right w:type="dxa" w:w="100"/>
+            </w:tcMar>
+          </w:tcPr>
+          <w:p>
+            <w:pPr>
+              <w:spacing w:after="20"/>
+            </w:pPr>
+            <w:r>
+              <w:rPr>
+                <w:b w:val="false"/>
+                <w:bCs w:val="false"/>
+                <w:color w:val="343740"/>
+                <w:sz w:val="18"/>
+                <w:szCs w:val="18"/>
+              </w:rPr>
+              <w:t xml:space="preserve">Register of record, Verified wallet</w:t>
+            </w:r>
+          </w:p>
+        </w:tc>
+        <w:tc>
+          <w:tcPr>
+            <w:tcW w:type="dxa" w:w="2900"/>
+            <w:tcBorders>
+              <w:top w:val="single" w:color="BDC1CB" w:sz="4"/>
+              <w:left w:val="single" w:color="BDC1CB" w:sz="4"/>
+              <w:bottom w:val="single" w:color="BDC1CB" w:sz="4"/>
+              <w:right w:val="single" w:color="BDC1CB" w:sz="4"/>
+            </w:tcBorders>
+            <w:tcMar>
+              <w:top w:type="dxa" w:w="60"/>
+              <w:left w:type="dxa" w:w="100"/>
+              <w:bottom w:type="dxa" w:w="60"/>
+              <w:right w:type="dxa" w:w="100"/>
+            </w:tcMar>
+          </w:tcPr>
+          <w:p>
+            <w:pPr>
+              <w:spacing w:after="20"/>
+            </w:pPr>
+            <w:r>
+              <w:rPr>
+                <w:b w:val="false"/>
+                <w:bCs w:val="false"/>
+                <w:color w:val="343740"/>
+                <w:sz w:val="18"/>
+                <w:szCs w:val="18"/>
+              </w:rPr>
+              <w:t xml:space="preserve">Tokeniser knowledge hub: How to tokenise a fund in Australia</w:t>
+            </w:r>
+          </w:p>
+          <w:p>
+            <w:pPr>
+              <w:spacing w:after="20"/>
+            </w:pPr>
+            <w:r>
+              <w:rPr>
+                <w:b w:val="false"/>
+                <w:bCs w:val="false"/>
+                <w:color w:val="343740"/>
+                <w:sz w:val="18"/>
+                <w:szCs w:val="18"/>
+              </w:rPr>
+              <w:t xml:space="preserve">https://tokeniser.com/resources/knowledge-hub/australia/how-to-tokenise-a-fund-in-australia</w:t>
+            </w:r>
+          </w:p>
+        </w:tc>
+        <w:tc>
+          <w:tcPr>
+            <w:tcW w:type="dxa" w:w="3838"/>
+            <w:tcBorders>
+              <w:top w:val="single" w:color="BDC1CB" w:sz="4"/>
+              <w:left w:val="single" w:color="BDC1CB" w:sz="4"/>
+              <w:bottom w:val="single" w:color="BDC1CB" w:sz="4"/>
+              <w:right w:val="single" w:color="BDC1CB" w:sz="4"/>
+            </w:tcBorders>
+            <w:tcMar>
+              <w:top w:type="dxa" w:w="60"/>
+              <w:left w:type="dxa" w:w="100"/>
+              <w:bottom w:type="dxa" w:w="60"/>
+              <w:right w:type="dxa" w:w="100"/>
+            </w:tcMar>
+          </w:tcPr>
+          <w:p>
+            <w:pPr>
+              <w:spacing w:after="20"/>
+            </w:pPr>
+            <w:r>
+              <w:rPr>
+                <w:b w:val="false"/>
+                <w:bCs w:val="false"/>
+                <w:color w:val="343740"/>
+                <w:sz w:val="18"/>
+                <w:szCs w:val="18"/>
+              </w:rPr>
+              <w:t xml:space="preserve">"The on-chain register is the register of record from day one."</w:t>
+            </w:r>
+          </w:p>
+        </w:tc>
+      </w:tr>
+      <w:tr>
+        <w:trPr>
+          <w:tblHeader w:val="false"/>
+        </w:trPr>
+        <w:tc>
+          <w:tcPr>
+            <w:tcW w:type="dxa" w:w="500"/>
+            <w:tcBorders>
+              <w:top w:val="single" w:color="BDC1CB" w:sz="4"/>
+              <w:left w:val="single" w:color="BDC1CB" w:sz="4"/>
+              <w:bottom w:val="single" w:color="BDC1CB" w:sz="4"/>
+              <w:right w:val="single" w:color="BDC1CB" w:sz="4"/>
+            </w:tcBorders>
+            <w:tcMar>
+              <w:top w:type="dxa" w:w="60"/>
+              <w:left w:type="dxa" w:w="100"/>
+              <w:bottom w:type="dxa" w:w="60"/>
+              <w:right w:type="dxa" w:w="100"/>
+            </w:tcMar>
+          </w:tcPr>
+          <w:p>
+            <w:pPr>
+              <w:spacing w:after="20"/>
+            </w:pPr>
+            <w:r>
+              <w:rPr>
+                <w:b w:val="false"/>
+                <w:bCs w:val="false"/>
+                <w:color w:val="343740"/>
+                <w:sz w:val="18"/>
+                <w:szCs w:val="18"/>
+              </w:rPr>
+              <w:t xml:space="preserve">28</w:t>
+            </w:r>
+          </w:p>
+        </w:tc>
+        <w:tc>
+          <w:tcPr>
+            <w:tcW w:type="dxa" w:w="2400"/>
+            <w:tcBorders>
+              <w:top w:val="single" w:color="BDC1CB" w:sz="4"/>
+              <w:left w:val="single" w:color="BDC1CB" w:sz="4"/>
+              <w:bottom w:val="single" w:color="BDC1CB" w:sz="4"/>
+              <w:right w:val="single" w:color="BDC1CB" w:sz="4"/>
+            </w:tcBorders>
+            <w:tcMar>
+              <w:top w:type="dxa" w:w="60"/>
+              <w:left w:type="dxa" w:w="100"/>
+              <w:bottom w:type="dxa" w:w="60"/>
+              <w:right w:type="dxa" w:w="100"/>
+            </w:tcMar>
+          </w:tcPr>
+          <w:p>
+            <w:pPr>
+              <w:spacing w:after="20"/>
+            </w:pPr>
+            <w:r>
+              <w:rPr>
+                <w:b w:val="false"/>
+                <w:bCs w:val="false"/>
+                <w:color w:val="343740"/>
+                <w:sz w:val="18"/>
+                <w:szCs w:val="18"/>
+              </w:rPr>
+              <w:t xml:space="preserve">Every transfer is checked against the rules first</w:t>
+            </w:r>
+          </w:p>
+        </w:tc>
+        <w:tc>
+          <w:tcPr>
+            <w:tcW w:type="dxa" w:w="2900"/>
+            <w:tcBorders>
+              <w:top w:val="single" w:color="BDC1CB" w:sz="4"/>
+              <w:left w:val="single" w:color="BDC1CB" w:sz="4"/>
+              <w:bottom w:val="single" w:color="BDC1CB" w:sz="4"/>
+              <w:right w:val="single" w:color="BDC1CB" w:sz="4"/>
+            </w:tcBorders>
+            <w:tcMar>
+              <w:top w:type="dxa" w:w="60"/>
+              <w:left w:type="dxa" w:w="100"/>
+              <w:bottom w:type="dxa" w:w="60"/>
+              <w:right w:type="dxa" w:w="100"/>
+            </w:tcMar>
+          </w:tcPr>
+          <w:p>
+            <w:pPr>
+              <w:spacing w:after="20"/>
+            </w:pPr>
+            <w:r>
+              <w:rPr>
+                <w:b w:val="false"/>
+                <w:bCs w:val="false"/>
+                <w:color w:val="343740"/>
+                <w:sz w:val="18"/>
+                <w:szCs w:val="18"/>
+              </w:rPr>
+              <w:t xml:space="preserve">Tokeniser knowledge hub: How does Tokeniser work</w:t>
+            </w:r>
+          </w:p>
+          <w:p>
+            <w:pPr>
+              <w:spacing w:after="20"/>
+            </w:pPr>
+            <w:r>
+              <w:rPr>
+                <w:b w:val="false"/>
+                <w:bCs w:val="false"/>
+                <w:color w:val="343740"/>
+                <w:sz w:val="18"/>
+                <w:szCs w:val="18"/>
+              </w:rPr>
+              <w:t xml:space="preserve">https://tokeniser.com/resources/knowledge-hub/platform/how-does-tokeniser-work</w:t>
+            </w:r>
+          </w:p>
+        </w:tc>
+        <w:tc>
+          <w:tcPr>
+            <w:tcW w:type="dxa" w:w="3838"/>
+            <w:tcBorders>
+              <w:top w:val="single" w:color="BDC1CB" w:sz="4"/>
+              <w:left w:val="single" w:color="BDC1CB" w:sz="4"/>
+              <w:bottom w:val="single" w:color="BDC1CB" w:sz="4"/>
+              <w:right w:val="single" w:color="BDC1CB" w:sz="4"/>
+            </w:tcBorders>
+            <w:tcMar>
+              <w:top w:type="dxa" w:w="60"/>
+              <w:left w:type="dxa" w:w="100"/>
+              <w:bottom w:type="dxa" w:w="60"/>
+              <w:right w:type="dxa" w:w="100"/>
+            </w:tcMar>
+          </w:tcPr>
+          <w:p>
+            <w:pPr>
+              <w:spacing w:after="20"/>
+            </w:pPr>
+            <w:r>
+              <w:rPr>
+                <w:b w:val="false"/>
+                <w:bCs w:val="false"/>
+                <w:color w:val="343740"/>
+                <w:sz w:val="18"/>
+                <w:szCs w:val="18"/>
+              </w:rPr>
+              <w:t xml:space="preserve">"Every transfer is checked against configured compliance parameters before submission."</w:t>
+            </w:r>
+          </w:p>
+        </w:tc>
+      </w:tr>
+      <w:tr>
+        <w:trPr>
+          <w:tblHeader w:val="false"/>
+        </w:trPr>
+        <w:tc>
+          <w:tcPr>
+            <w:tcW w:type="dxa" w:w="500"/>
+            <w:tcBorders>
+              <w:top w:val="single" w:color="BDC1CB" w:sz="4"/>
+              <w:left w:val="single" w:color="BDC1CB" w:sz="4"/>
+              <w:bottom w:val="single" w:color="BDC1CB" w:sz="4"/>
+              <w:right w:val="single" w:color="BDC1CB" w:sz="4"/>
+            </w:tcBorders>
+            <w:tcMar>
+              <w:top w:type="dxa" w:w="60"/>
+              <w:left w:type="dxa" w:w="100"/>
+              <w:bottom w:type="dxa" w:w="60"/>
+              <w:right w:type="dxa" w:w="100"/>
+            </w:tcMar>
+          </w:tcPr>
+          <w:p>
+            <w:pPr>
+              <w:spacing w:after="20"/>
+            </w:pPr>
+            <w:r>
+              <w:rPr>
+                <w:b w:val="false"/>
+                <w:bCs w:val="false"/>
+                <w:color w:val="343740"/>
+                <w:sz w:val="18"/>
+                <w:szCs w:val="18"/>
+              </w:rPr>
+              <w:t xml:space="preserve">29</w:t>
+            </w:r>
+          </w:p>
+        </w:tc>
+        <w:tc>
+          <w:tcPr>
+            <w:tcW w:type="dxa" w:w="2400"/>
+            <w:tcBorders>
+              <w:top w:val="single" w:color="BDC1CB" w:sz="4"/>
+              <w:left w:val="single" w:color="BDC1CB" w:sz="4"/>
+              <w:bottom w:val="single" w:color="BDC1CB" w:sz="4"/>
+              <w:right w:val="single" w:color="BDC1CB" w:sz="4"/>
+            </w:tcBorders>
+            <w:tcMar>
+              <w:top w:type="dxa" w:w="60"/>
+              <w:left w:type="dxa" w:w="100"/>
+              <w:bottom w:type="dxa" w:w="60"/>
+              <w:right w:type="dxa" w:w="100"/>
+            </w:tcMar>
+          </w:tcPr>
+          <w:p>
+            <w:pPr>
+              <w:spacing w:after="20"/>
+            </w:pPr>
+            <w:r>
+              <w:rPr>
+                <w:b w:val="false"/>
+                <w:bCs w:val="false"/>
+                <w:color w:val="343740"/>
+                <w:sz w:val="18"/>
+                <w:szCs w:val="18"/>
+              </w:rPr>
+              <w:t xml:space="preserve">breaches are rejected</w:t>
+            </w:r>
+          </w:p>
+        </w:tc>
+        <w:tc>
+          <w:tcPr>
+            <w:tcW w:type="dxa" w:w="2900"/>
+            <w:tcBorders>
+              <w:top w:val="single" w:color="BDC1CB" w:sz="4"/>
+              <w:left w:val="single" w:color="BDC1CB" w:sz="4"/>
+              <w:bottom w:val="single" w:color="BDC1CB" w:sz="4"/>
+              <w:right w:val="single" w:color="BDC1CB" w:sz="4"/>
+            </w:tcBorders>
+            <w:tcMar>
+              <w:top w:type="dxa" w:w="60"/>
+              <w:left w:type="dxa" w:w="100"/>
+              <w:bottom w:type="dxa" w:w="60"/>
+              <w:right w:type="dxa" w:w="100"/>
+            </w:tcMar>
+          </w:tcPr>
+          <w:p>
+            <w:pPr>
+              <w:spacing w:after="20"/>
+            </w:pPr>
+            <w:r>
+              <w:rPr>
+                <w:b w:val="false"/>
+                <w:bCs w:val="false"/>
+                <w:color w:val="343740"/>
+                <w:sz w:val="18"/>
+                <w:szCs w:val="18"/>
+              </w:rPr>
+              <w:t xml:space="preserve">Tokeniser knowledge hub: How does Tokeniser work</w:t>
+            </w:r>
+          </w:p>
+          <w:p>
+            <w:pPr>
+              <w:spacing w:after="20"/>
+            </w:pPr>
+            <w:r>
+              <w:rPr>
+                <w:b w:val="false"/>
+                <w:bCs w:val="false"/>
+                <w:color w:val="343740"/>
+                <w:sz w:val="18"/>
+                <w:szCs w:val="18"/>
+              </w:rPr>
+              <w:t xml:space="preserve">https://tokeniser.com/resources/knowledge-hub/platform/how-does-tokeniser-work</w:t>
+            </w:r>
+          </w:p>
+        </w:tc>
+        <w:tc>
+          <w:tcPr>
+            <w:tcW w:type="dxa" w:w="3838"/>
+            <w:tcBorders>
+              <w:top w:val="single" w:color="BDC1CB" w:sz="4"/>
+              <w:left w:val="single" w:color="BDC1CB" w:sz="4"/>
+              <w:bottom w:val="single" w:color="BDC1CB" w:sz="4"/>
+              <w:right w:val="single" w:color="BDC1CB" w:sz="4"/>
+            </w:tcBorders>
+            <w:tcMar>
+              <w:top w:type="dxa" w:w="60"/>
+              <w:left w:type="dxa" w:w="100"/>
+              <w:bottom w:type="dxa" w:w="60"/>
+              <w:right w:type="dxa" w:w="100"/>
+            </w:tcMar>
+          </w:tcPr>
+          <w:p>
+            <w:pPr>
+              <w:spacing w:after="20"/>
+            </w:pPr>
+            <w:r>
+              <w:rPr>
+                <w:b w:val="false"/>
+                <w:bCs w:val="false"/>
+                <w:color w:val="343740"/>
+                <w:sz w:val="18"/>
+                <w:szCs w:val="18"/>
+              </w:rPr>
+              <w:t xml:space="preserve">"Transfers to unverified wallets, ineligible investors, or in breach of restrictions are rejected."</w:t>
+            </w:r>
+          </w:p>
+        </w:tc>
+      </w:tr>
+      <w:tr>
+        <w:trPr>
+          <w:tblHeader w:val="false"/>
+        </w:trPr>
+        <w:tc>
+          <w:tcPr>
+            <w:tcW w:type="dxa" w:w="500"/>
+            <w:tcBorders>
+              <w:top w:val="single" w:color="BDC1CB" w:sz="4"/>
+              <w:left w:val="single" w:color="BDC1CB" w:sz="4"/>
+              <w:bottom w:val="single" w:color="BDC1CB" w:sz="4"/>
+              <w:right w:val="single" w:color="BDC1CB" w:sz="4"/>
+            </w:tcBorders>
+            <w:tcMar>
+              <w:top w:type="dxa" w:w="60"/>
+              <w:left w:type="dxa" w:w="100"/>
+              <w:bottom w:type="dxa" w:w="60"/>
+              <w:right w:type="dxa" w:w="100"/>
+            </w:tcMar>
+          </w:tcPr>
+          <w:p>
+            <w:pPr>
+              <w:spacing w:after="20"/>
+            </w:pPr>
+            <w:r>
+              <w:rPr>
+                <w:b w:val="false"/>
+                <w:bCs w:val="false"/>
+                <w:color w:val="343740"/>
+                <w:sz w:val="18"/>
+                <w:szCs w:val="18"/>
+              </w:rPr>
+              <w:t xml:space="preserve">30</w:t>
+            </w:r>
+          </w:p>
+        </w:tc>
+        <w:tc>
+          <w:tcPr>
+            <w:tcW w:type="dxa" w:w="2400"/>
+            <w:tcBorders>
+              <w:top w:val="single" w:color="BDC1CB" w:sz="4"/>
+              <w:left w:val="single" w:color="BDC1CB" w:sz="4"/>
+              <w:bottom w:val="single" w:color="BDC1CB" w:sz="4"/>
+              <w:right w:val="single" w:color="BDC1CB" w:sz="4"/>
+            </w:tcBorders>
+            <w:tcMar>
+              <w:top w:type="dxa" w:w="60"/>
+              <w:left w:type="dxa" w:w="100"/>
+              <w:bottom w:type="dxa" w:w="60"/>
+              <w:right w:type="dxa" w:w="100"/>
+            </w:tcMar>
+          </w:tcPr>
+          <w:p>
+            <w:pPr>
+              <w:spacing w:after="20"/>
+            </w:pPr>
+            <w:r>
+              <w:rPr>
+                <w:b w:val="false"/>
+                <w:bCs w:val="false"/>
+                <w:color w:val="343740"/>
+                <w:sz w:val="18"/>
+                <w:szCs w:val="18"/>
+              </w:rPr>
+              <w:t xml:space="preserve">When investors hold their own wallet</w:t>
+            </w:r>
+          </w:p>
+        </w:tc>
+        <w:tc>
+          <w:tcPr>
+            <w:tcW w:type="dxa" w:w="2900"/>
+            <w:tcBorders>
+              <w:top w:val="single" w:color="BDC1CB" w:sz="4"/>
+              <w:left w:val="single" w:color="BDC1CB" w:sz="4"/>
+              <w:bottom w:val="single" w:color="BDC1CB" w:sz="4"/>
+              <w:right w:val="single" w:color="BDC1CB" w:sz="4"/>
+            </w:tcBorders>
+            <w:tcMar>
+              <w:top w:type="dxa" w:w="60"/>
+              <w:left w:type="dxa" w:w="100"/>
+              <w:bottom w:type="dxa" w:w="60"/>
+              <w:right w:type="dxa" w:w="100"/>
+            </w:tcMar>
+          </w:tcPr>
+          <w:p>
+            <w:pPr>
+              <w:spacing w:after="20"/>
+            </w:pPr>
+            <w:r>
+              <w:rPr>
+                <w:b w:val="false"/>
+                <w:bCs w:val="false"/>
+                <w:color w:val="343740"/>
+                <w:sz w:val="18"/>
+                <w:szCs w:val="18"/>
+              </w:rPr>
+              <w:t xml:space="preserve">Tokeniser knowledge hub: How does Tokeniser work</w:t>
+            </w:r>
+          </w:p>
+          <w:p>
+            <w:pPr>
+              <w:spacing w:after="20"/>
+            </w:pPr>
+            <w:r>
+              <w:rPr>
+                <w:b w:val="false"/>
+                <w:bCs w:val="false"/>
+                <w:color w:val="343740"/>
+                <w:sz w:val="18"/>
+                <w:szCs w:val="18"/>
+              </w:rPr>
+              <w:t xml:space="preserve">https://tokeniser.com/resources/knowledge-hub/platform/how-does-tokeniser-work</w:t>
+            </w:r>
+          </w:p>
+        </w:tc>
+        <w:tc>
+          <w:tcPr>
+            <w:tcW w:type="dxa" w:w="3838"/>
+            <w:tcBorders>
+              <w:top w:val="single" w:color="BDC1CB" w:sz="4"/>
+              <w:left w:val="single" w:color="BDC1CB" w:sz="4"/>
+              <w:bottom w:val="single" w:color="BDC1CB" w:sz="4"/>
+              <w:right w:val="single" w:color="BDC1CB" w:sz="4"/>
+            </w:tcBorders>
+            <w:tcMar>
+              <w:top w:type="dxa" w:w="60"/>
+              <w:left w:type="dxa" w:w="100"/>
+              <w:bottom w:type="dxa" w:w="60"/>
+              <w:right w:type="dxa" w:w="100"/>
+            </w:tcMar>
+          </w:tcPr>
+          <w:p>
+            <w:pPr>
+              <w:spacing w:after="20"/>
+            </w:pPr>
+            <w:r>
+              <w:rPr>
+                <w:b w:val="false"/>
+                <w:bCs w:val="false"/>
+                <w:color w:val="343740"/>
+                <w:sz w:val="18"/>
+                <w:szCs w:val="18"/>
+              </w:rPr>
+              <w:t xml:space="preserve">"the investor either holds their own private key (non-custodial wallet)"</w:t>
+            </w:r>
+          </w:p>
+        </w:tc>
+      </w:tr>
+      <w:tr>
+        <w:trPr>
+          <w:tblHeader w:val="false"/>
+        </w:trPr>
+        <w:tc>
+          <w:tcPr>
+            <w:tcW w:type="dxa" w:w="500"/>
+            <w:tcBorders>
+              <w:top w:val="single" w:color="BDC1CB" w:sz="4"/>
+              <w:left w:val="single" w:color="BDC1CB" w:sz="4"/>
+              <w:bottom w:val="single" w:color="BDC1CB" w:sz="4"/>
+              <w:right w:val="single" w:color="BDC1CB" w:sz="4"/>
+            </w:tcBorders>
+            <w:tcMar>
+              <w:top w:type="dxa" w:w="60"/>
+              <w:left w:type="dxa" w:w="100"/>
+              <w:bottom w:type="dxa" w:w="60"/>
+              <w:right w:type="dxa" w:w="100"/>
+            </w:tcMar>
+          </w:tcPr>
+          <w:p>
+            <w:pPr>
+              <w:spacing w:after="20"/>
+            </w:pPr>
+            <w:r>
+              <w:rPr>
+                <w:b w:val="false"/>
+                <w:bCs w:val="false"/>
+                <w:color w:val="343740"/>
+                <w:sz w:val="18"/>
+                <w:szCs w:val="18"/>
+              </w:rPr>
+              <w:t xml:space="preserve">31</w:t>
+            </w:r>
+          </w:p>
+        </w:tc>
+        <w:tc>
+          <w:tcPr>
+            <w:tcW w:type="dxa" w:w="2400"/>
+            <w:tcBorders>
+              <w:top w:val="single" w:color="BDC1CB" w:sz="4"/>
+              <w:left w:val="single" w:color="BDC1CB" w:sz="4"/>
+              <w:bottom w:val="single" w:color="BDC1CB" w:sz="4"/>
+              <w:right w:val="single" w:color="BDC1CB" w:sz="4"/>
+            </w:tcBorders>
+            <w:tcMar>
+              <w:top w:type="dxa" w:w="60"/>
+              <w:left w:type="dxa" w:w="100"/>
+              <w:bottom w:type="dxa" w:w="60"/>
+              <w:right w:type="dxa" w:w="100"/>
+            </w:tcMar>
+          </w:tcPr>
+          <w:p>
+            <w:pPr>
+              <w:spacing w:after="20"/>
+            </w:pPr>
+            <w:r>
+              <w:rPr>
+                <w:b w:val="false"/>
+                <w:bCs w:val="false"/>
+                <w:color w:val="343740"/>
+                <w:sz w:val="18"/>
+                <w:szCs w:val="18"/>
+              </w:rPr>
+              <w:t xml:space="preserve">transfer and payment complete together, in seconds</w:t>
+            </w:r>
+          </w:p>
+        </w:tc>
+        <w:tc>
+          <w:tcPr>
+            <w:tcW w:type="dxa" w:w="2900"/>
+            <w:tcBorders>
+              <w:top w:val="single" w:color="BDC1CB" w:sz="4"/>
+              <w:left w:val="single" w:color="BDC1CB" w:sz="4"/>
+              <w:bottom w:val="single" w:color="BDC1CB" w:sz="4"/>
+              <w:right w:val="single" w:color="BDC1CB" w:sz="4"/>
+            </w:tcBorders>
+            <w:tcMar>
+              <w:top w:type="dxa" w:w="60"/>
+              <w:left w:type="dxa" w:w="100"/>
+              <w:bottom w:type="dxa" w:w="60"/>
+              <w:right w:type="dxa" w:w="100"/>
+            </w:tcMar>
+          </w:tcPr>
+          <w:p>
+            <w:pPr>
+              <w:spacing w:after="20"/>
+            </w:pPr>
+            <w:r>
+              <w:rPr>
+                <w:b w:val="false"/>
+                <w:bCs w:val="false"/>
+                <w:color w:val="343740"/>
+                <w:sz w:val="18"/>
+                <w:szCs w:val="18"/>
+              </w:rPr>
+              <w:t xml:space="preserve">Tokeniser knowledge hub: How does Tokeniser work</w:t>
+            </w:r>
+          </w:p>
+          <w:p>
+            <w:pPr>
+              <w:spacing w:after="20"/>
+            </w:pPr>
+            <w:r>
+              <w:rPr>
+                <w:b w:val="false"/>
+                <w:bCs w:val="false"/>
+                <w:color w:val="343740"/>
+                <w:sz w:val="18"/>
+                <w:szCs w:val="18"/>
+              </w:rPr>
+              <w:t xml:space="preserve">https://tokeniser.com/resources/knowledge-hub/platform/how-does-tokeniser-work</w:t>
+            </w:r>
+          </w:p>
+        </w:tc>
+        <w:tc>
+          <w:tcPr>
+            <w:tcW w:type="dxa" w:w="3838"/>
+            <w:tcBorders>
+              <w:top w:val="single" w:color="BDC1CB" w:sz="4"/>
+              <w:left w:val="single" w:color="BDC1CB" w:sz="4"/>
+              <w:bottom w:val="single" w:color="BDC1CB" w:sz="4"/>
+              <w:right w:val="single" w:color="BDC1CB" w:sz="4"/>
+            </w:tcBorders>
+            <w:tcMar>
+              <w:top w:type="dxa" w:w="60"/>
+              <w:left w:type="dxa" w:w="100"/>
+              <w:bottom w:type="dxa" w:w="60"/>
+              <w:right w:type="dxa" w:w="100"/>
+            </w:tcMar>
+          </w:tcPr>
+          <w:p>
+            <w:pPr>
+              <w:spacing w:after="20"/>
+            </w:pPr>
+            <w:r>
+              <w:rPr>
+                <w:b w:val="false"/>
+                <w:bCs w:val="false"/>
+                <w:color w:val="343740"/>
+                <w:sz w:val="18"/>
+                <w:szCs w:val="18"/>
+              </w:rPr>
+              <w:t xml:space="preserve">"For non-custodial wallets, atomic settlements, transfer and payment complete simultaneously in seconds."</w:t>
+            </w:r>
+          </w:p>
+        </w:tc>
+      </w:tr>
+      <w:tr>
+        <w:trPr>
+          <w:tblHeader w:val="false"/>
+        </w:trPr>
+        <w:tc>
+          <w:tcPr>
+            <w:tcW w:type="dxa" w:w="500"/>
+            <w:tcBorders>
+              <w:top w:val="single" w:color="BDC1CB" w:sz="4"/>
+              <w:left w:val="single" w:color="BDC1CB" w:sz="4"/>
+              <w:bottom w:val="single" w:color="BDC1CB" w:sz="4"/>
+              <w:right w:val="single" w:color="BDC1CB" w:sz="4"/>
+            </w:tcBorders>
+            <w:tcMar>
+              <w:top w:type="dxa" w:w="60"/>
+              <w:left w:type="dxa" w:w="100"/>
+              <w:bottom w:type="dxa" w:w="60"/>
+              <w:right w:type="dxa" w:w="100"/>
+            </w:tcMar>
+          </w:tcPr>
+          <w:p>
+            <w:pPr>
+              <w:spacing w:after="20"/>
+            </w:pPr>
+            <w:r>
+              <w:rPr>
+                <w:b w:val="false"/>
+                <w:bCs w:val="false"/>
+                <w:color w:val="343740"/>
+                <w:sz w:val="18"/>
+                <w:szCs w:val="18"/>
+              </w:rPr>
+              <w:t xml:space="preserve">32</w:t>
+            </w:r>
+          </w:p>
+        </w:tc>
+        <w:tc>
+          <w:tcPr>
+            <w:tcW w:type="dxa" w:w="2400"/>
+            <w:tcBorders>
+              <w:top w:val="single" w:color="BDC1CB" w:sz="4"/>
+              <w:left w:val="single" w:color="BDC1CB" w:sz="4"/>
+              <w:bottom w:val="single" w:color="BDC1CB" w:sz="4"/>
+              <w:right w:val="single" w:color="BDC1CB" w:sz="4"/>
+            </w:tcBorders>
+            <w:tcMar>
+              <w:top w:type="dxa" w:w="60"/>
+              <w:left w:type="dxa" w:w="100"/>
+              <w:bottom w:type="dxa" w:w="60"/>
+              <w:right w:type="dxa" w:w="100"/>
+            </w:tcMar>
+          </w:tcPr>
+          <w:p>
+            <w:pPr>
+              <w:spacing w:after="20"/>
+            </w:pPr>
+            <w:r>
+              <w:rPr>
+                <w:b w:val="false"/>
+                <w:bCs w:val="false"/>
+                <w:color w:val="343740"/>
+                <w:sz w:val="18"/>
+                <w:szCs w:val="18"/>
+              </w:rPr>
+              <w:t xml:space="preserve">Tokeniser operates on Redbelly Network, Australia's public digital token infrastructure</w:t>
+            </w:r>
+          </w:p>
+        </w:tc>
+        <w:tc>
+          <w:tcPr>
+            <w:tcW w:type="dxa" w:w="2900"/>
+            <w:tcBorders>
+              <w:top w:val="single" w:color="BDC1CB" w:sz="4"/>
+              <w:left w:val="single" w:color="BDC1CB" w:sz="4"/>
+              <w:bottom w:val="single" w:color="BDC1CB" w:sz="4"/>
+              <w:right w:val="single" w:color="BDC1CB" w:sz="4"/>
+            </w:tcBorders>
+            <w:tcMar>
+              <w:top w:type="dxa" w:w="60"/>
+              <w:left w:type="dxa" w:w="100"/>
+              <w:bottom w:type="dxa" w:w="60"/>
+              <w:right w:type="dxa" w:w="100"/>
+            </w:tcMar>
+          </w:tcPr>
+          <w:p>
+            <w:pPr>
+              <w:spacing w:after="20"/>
+            </w:pPr>
+            <w:r>
+              <w:rPr>
+                <w:b w:val="false"/>
+                <w:bCs w:val="false"/>
+                <w:color w:val="343740"/>
+                <w:sz w:val="18"/>
+                <w:szCs w:val="18"/>
+              </w:rPr>
+              <w:t xml:space="preserve">Tokeniser, home page and FAQ</w:t>
+            </w:r>
+          </w:p>
+          <w:p>
+            <w:pPr>
+              <w:spacing w:after="20"/>
+            </w:pPr>
+            <w:r>
+              <w:rPr>
+                <w:b w:val="false"/>
+                <w:bCs w:val="false"/>
+                <w:color w:val="343740"/>
+                <w:sz w:val="18"/>
+                <w:szCs w:val="18"/>
+              </w:rPr>
+              <w:t xml:space="preserve">https://tokeniser.com/</w:t>
+            </w:r>
+          </w:p>
+        </w:tc>
+        <w:tc>
+          <w:tcPr>
+            <w:tcW w:type="dxa" w:w="3838"/>
+            <w:tcBorders>
+              <w:top w:val="single" w:color="BDC1CB" w:sz="4"/>
+              <w:left w:val="single" w:color="BDC1CB" w:sz="4"/>
+              <w:bottom w:val="single" w:color="BDC1CB" w:sz="4"/>
+              <w:right w:val="single" w:color="BDC1CB" w:sz="4"/>
+            </w:tcBorders>
+            <w:tcMar>
+              <w:top w:type="dxa" w:w="60"/>
+              <w:left w:type="dxa" w:w="100"/>
+              <w:bottom w:type="dxa" w:w="60"/>
+              <w:right w:type="dxa" w:w="100"/>
+            </w:tcMar>
+          </w:tcPr>
+          <w:p>
+            <w:pPr>
+              <w:spacing w:after="20"/>
+            </w:pPr>
+            <w:r>
+              <w:rPr>
+                <w:b w:val="false"/>
+                <w:bCs w:val="false"/>
+                <w:color w:val="343740"/>
+                <w:sz w:val="18"/>
+                <w:szCs w:val="18"/>
+              </w:rPr>
+              <w:t xml:space="preserve">"Tokeniser operates on Redbelly Network, Australia's public digital token infrastructure"</w:t>
+            </w:r>
+          </w:p>
+        </w:tc>
+      </w:tr>
+      <w:tr>
+        <w:trPr>
+          <w:tblHeader w:val="false"/>
+        </w:trPr>
+        <w:tc>
+          <w:tcPr>
+            <w:tcW w:type="dxa" w:w="500"/>
+            <w:tcBorders>
+              <w:top w:val="single" w:color="BDC1CB" w:sz="4"/>
+              <w:left w:val="single" w:color="BDC1CB" w:sz="4"/>
+              <w:bottom w:val="single" w:color="BDC1CB" w:sz="4"/>
+              <w:right w:val="single" w:color="BDC1CB" w:sz="4"/>
+            </w:tcBorders>
+            <w:tcMar>
+              <w:top w:type="dxa" w:w="60"/>
+              <w:left w:type="dxa" w:w="100"/>
+              <w:bottom w:type="dxa" w:w="60"/>
+              <w:right w:type="dxa" w:w="100"/>
+            </w:tcMar>
+          </w:tcPr>
+          <w:p>
+            <w:pPr>
+              <w:spacing w:after="20"/>
+            </w:pPr>
+            <w:r>
+              <w:rPr>
+                <w:b w:val="false"/>
+                <w:bCs w:val="false"/>
+                <w:color w:val="343740"/>
+                <w:sz w:val="18"/>
+                <w:szCs w:val="18"/>
+              </w:rPr>
+              <w:t xml:space="preserve">33</w:t>
             </w:r>
           </w:p>
         </w:tc>
@@ -6856,7 +8130,7 @@
                 <w:sz w:val="18"/>
                 <w:szCs w:val="18"/>
               </w:rPr>
-              <w:t xml:space="preserve">Drawn for this video. No stock footage or stock icons.</w:t>
+              <w:t xml:space="preserve">Designed for this video with Claude Design and rendered frame by frame. No stock footage or stock icons.</w:t>
             </w:r>
           </w:p>
         </w:tc>
@@ -6992,7 +8266,7 @@
         <w:sz w:val="16"/>
         <w:szCs w:val="16"/>
       </w:rPr>
-      <w:t xml:space="preserve">From fund to token, script version 1. Last verified 14 Oct 2026.    Page </w:t>
+      <w:t xml:space="preserve">From fund to token, script version 2. Last verified 14 Oct 2026.    Page </w:t>
     </w:r>
     <w:r>
       <w:rPr>

</xml_diff>

<commit_message>
Add sound effects timed to every pop in the animation
</commit_message>
<xml_diff>
--- a/public/docs/tokenisation-explainer-script.docx
+++ b/public/docs/tokenisation-explainer-script.docx
@@ -8062,6 +8062,75 @@
                 <w:szCs w:val="18"/>
               </w:rPr>
               <w:t xml:space="preserve">Made for this video from code. No third party audio.</w:t>
+            </w:r>
+          </w:p>
+        </w:tc>
+      </w:tr>
+      <w:tr>
+        <w:trPr>
+          <w:tblHeader w:val="false"/>
+        </w:trPr>
+        <w:tc>
+          <w:tcPr>
+            <w:tcW w:type="dxa" w:w="2400"/>
+            <w:tcBorders>
+              <w:top w:val="single" w:color="BDC1CB" w:sz="4"/>
+              <w:left w:val="single" w:color="BDC1CB" w:sz="4"/>
+              <w:bottom w:val="single" w:color="BDC1CB" w:sz="4"/>
+              <w:right w:val="single" w:color="BDC1CB" w:sz="4"/>
+            </w:tcBorders>
+            <w:tcMar>
+              <w:top w:type="dxa" w:w="60"/>
+              <w:left w:type="dxa" w:w="100"/>
+              <w:bottom w:type="dxa" w:w="60"/>
+              <w:right w:type="dxa" w:w="100"/>
+            </w:tcMar>
+          </w:tcPr>
+          <w:p>
+            <w:pPr>
+              <w:spacing w:after="20"/>
+            </w:pPr>
+            <w:r>
+              <w:rPr>
+                <w:b w:val="false"/>
+                <w:bCs w:val="false"/>
+                <w:color w:val="343740"/>
+                <w:sz w:val="18"/>
+                <w:szCs w:val="18"/>
+              </w:rPr>
+              <w:t xml:space="preserve">Sound effects</w:t>
+            </w:r>
+          </w:p>
+        </w:tc>
+        <w:tc>
+          <w:tcPr>
+            <w:tcW w:type="dxa" w:w="7238"/>
+            <w:tcBorders>
+              <w:top w:val="single" w:color="BDC1CB" w:sz="4"/>
+              <w:left w:val="single" w:color="BDC1CB" w:sz="4"/>
+              <w:bottom w:val="single" w:color="BDC1CB" w:sz="4"/>
+              <w:right w:val="single" w:color="BDC1CB" w:sz="4"/>
+            </w:tcBorders>
+            <w:tcMar>
+              <w:top w:type="dxa" w:w="60"/>
+              <w:left w:type="dxa" w:w="100"/>
+              <w:bottom w:type="dxa" w:w="60"/>
+              <w:right w:type="dxa" w:w="100"/>
+            </w:tcMar>
+          </w:tcPr>
+          <w:p>
+            <w:pPr>
+              <w:spacing w:after="20"/>
+            </w:pPr>
+            <w:r>
+              <w:rPr>
+                <w:b w:val="false"/>
+                <w:bCs w:val="false"/>
+                <w:color w:val="343740"/>
+                <w:sz w:val="18"/>
+                <w:szCs w:val="18"/>
+              </w:rPr>
+              <w:t xml:space="preserve">Made for this video from code, timed to the animation.</w:t>
             </w:r>
           </w:p>
         </w:tc>

</xml_diff>